<commit_message>
Intermediate notes of Selenium
</commit_message>
<xml_diff>
--- a/NOTES/Selenium_Notes_WebDriverArchitecture.docx
+++ b/NOTES/Selenium_Notes_WebDriverArchitecture.docx
@@ -1291,7 +1291,7 @@
       </w:tblPr>
       <w:tblGrid>
         <w:gridCol w:w="1548"/>
-        <w:gridCol w:w="946"/>
+        <w:gridCol w:w="1849"/>
       </w:tblGrid>
       <w:tr>
         <w:trPr>
@@ -1322,7 +1322,7 @@
         </w:tc>
         <w:tc>
           <w:tcPr>
-            <w:tcW w:w="0" w:type="auto"/>
+            <w:tcW w:w="1804" w:type="dxa"/>
             <w:vAlign w:val="center"/>
             <w:hideMark/>
           </w:tcPr>
@@ -1361,7 +1361,7 @@
         </w:tc>
         <w:tc>
           <w:tcPr>
-            <w:tcW w:w="0" w:type="auto"/>
+            <w:tcW w:w="1804" w:type="dxa"/>
             <w:vAlign w:val="center"/>
             <w:hideMark/>
           </w:tcPr>
@@ -1390,7 +1390,7 @@
         </w:tc>
         <w:tc>
           <w:tcPr>
-            <w:tcW w:w="0" w:type="auto"/>
+            <w:tcW w:w="1804" w:type="dxa"/>
             <w:vAlign w:val="center"/>
             <w:hideMark/>
           </w:tcPr>
@@ -1419,7 +1419,7 @@
         </w:tc>
         <w:tc>
           <w:tcPr>
-            <w:tcW w:w="0" w:type="auto"/>
+            <w:tcW w:w="1804" w:type="dxa"/>
             <w:vAlign w:val="center"/>
             <w:hideMark/>
           </w:tcPr>
@@ -1780,7 +1780,7 @@
           <w:noProof/>
         </w:rPr>
         <w:drawing>
-          <wp:inline distT="0" distB="0" distL="0" distR="0" wp14:anchorId="0E0F6D28" wp14:editId="6FD43B26">
+          <wp:inline distT="0" distB="0" distL="0" distR="0" wp14:anchorId="0E0F6D28" wp14:editId="50E31410">
             <wp:extent cx="5731510" cy="3648710"/>
             <wp:effectExtent l="0" t="0" r="2540" b="8890"/>
             <wp:docPr id="1897979383" name="Picture 2" descr="Architecture of Selenium WebDriver | BrowserStack"/>

</xml_diff>